<commit_message>
Restore V23 simulator and rename inspection unit to Scout
</commit_message>
<xml_diff>
--- a/DSR_V23_Command_Reference.docx
+++ b/DSR_V23_Command_Reference.docx
@@ -283,7 +283,7 @@
           <w:rFonts w:ascii="Aptos" w:hAnsi="Aptos"/>
           <w:sz w:val="19"/>
         </w:rPr>
-        <w:t>4. Resets all RCs, Patrol and Assessment Crew (PAC) units, and MPS units to their initial states.</w:t>
+        <w:t>4. Resets all RCs, Scout units, and MPS units to their initial states.</w:t>
       </w:r>
     </w:p>
     <w:p>
@@ -333,7 +333,26 @@
         <w:ind w:left="288" w:hanging="288"/>
       </w:pPr>
       <w:r>
-        <w:t>7. Resets the score and immediately records the T0 weighted contribution sum(abs(P) * W) over energized loads.</w:t>
+        <w:rPr>
+          <w:rFonts w:ascii="Aptos" w:hAnsi="Aptos"/>
+          <w:sz w:val="19"/>
+        </w:rPr>
+        <w:t xml:space="preserve">7. Resets the score and immediately records </w:t>
+      </w:r>
+      <w:r>
+        <w:rPr>
+          <w:rFonts w:ascii="Consolas" w:hAnsi="Consolas"/>
+          <w:color w:val="1F4E79"/>
+          <w:sz w:val="17"/>
+        </w:rPr>
+        <w:t>P0</w:t>
+      </w:r>
+      <w:r>
+        <w:rPr>
+          <w:rFonts w:ascii="Aptos" w:hAnsi="Aptos"/>
+          <w:sz w:val="19"/>
+        </w:rPr>
+        <w:t>.</w:t>
       </w:r>
     </w:p>
     <w:p>
@@ -563,7 +582,49 @@
     </w:p>
     <w:p>
       <w:r>
-        <w:t>Meaning: Reloads the map, network elements, Switches, roads, and mobile objects without loading the fault scenario. The simulator returns to Time Step = 0, but the game has not started and no weighted T0 contribution has been scored.</w:t>
+        <w:rPr>
+          <w:rFonts w:ascii="Aptos" w:hAnsi="Aptos"/>
+          <w:b/>
+          <w:sz w:val="19"/>
+        </w:rPr>
+        <w:t>Meaning:</w:t>
+      </w:r>
+      <w:r>
+        <w:rPr>
+          <w:rFonts w:ascii="Aptos" w:hAnsi="Aptos"/>
+          <w:sz w:val="19"/>
+        </w:rPr>
+        <w:t xml:space="preserve"> Reloads the map, network elements, Switches, roads, and mobile objects without loading the fault scenario. The simulator returns to </w:t>
+      </w:r>
+      <w:r>
+        <w:rPr>
+          <w:rFonts w:ascii="Consolas" w:hAnsi="Consolas"/>
+          <w:color w:val="1F4E79"/>
+          <w:sz w:val="17"/>
+        </w:rPr>
+        <w:t>Time Step = 0</w:t>
+      </w:r>
+      <w:r>
+        <w:rPr>
+          <w:rFonts w:ascii="Aptos" w:hAnsi="Aptos"/>
+          <w:sz w:val="19"/>
+        </w:rPr>
+        <w:t xml:space="preserve">, but the game has not started and no </w:t>
+      </w:r>
+      <w:r>
+        <w:rPr>
+          <w:rFonts w:ascii="Consolas" w:hAnsi="Consolas"/>
+          <w:color w:val="1F4E79"/>
+          <w:sz w:val="17"/>
+        </w:rPr>
+        <w:t>P0</w:t>
+      </w:r>
+      <w:r>
+        <w:rPr>
+          <w:rFonts w:ascii="Aptos" w:hAnsi="Aptos"/>
+          <w:sz w:val="19"/>
+        </w:rPr>
+        <w:t xml:space="preserve"> has been scored.</w:t>
       </w:r>
     </w:p>
     <w:p>
@@ -1592,7 +1653,7 @@
         <w:br/>
         <w:t xml:space="preserve">    "RC2": {"type": "move", "waypoints": [[0, 0]]},</w:t>
         <w:br/>
-        <w:t xml:space="preserve">    "PAC1": {"type": "stay"},</w:t>
+        <w:t xml:space="preserve">    "Scout": {"type": "stay"},</w:t>
         <w:br/>
         <w:t xml:space="preserve">    "MPS1": {"type": "supply", "p": 300, "q": 140}</w:t>
         <w:br/>
@@ -1998,7 +2059,7 @@
         <w:br/>
         <w:t xml:space="preserve">    },</w:t>
         <w:br/>
-        <w:t xml:space="preserve">    "PAC1": {</w:t>
+        <w:t xml:space="preserve">    "Scout": {</w:t>
         <w:br/>
         <w:t xml:space="preserve">      "type": "stay"</w:t>
         <w:br/>
@@ -2451,7 +2512,7 @@
                 <w:color w:val="FFFFFF"/>
                 <w:sz w:val="16"/>
               </w:rPr>
-              <w:t>PAC</w:t>
+              <w:t>Scout</w:t>
             </w:r>
           </w:p>
         </w:tc>
@@ -3153,7 +3214,7 @@
           <w:b/>
           <w:sz w:val="19"/>
         </w:rPr>
-        <w:t>Moving RC or PAC:</w:t>
+        <w:t>Moving RC or Scout:</w:t>
       </w:r>
       <w:r>
         <w:rPr>
@@ -3258,7 +3319,7 @@
           <w:b/>
           <w:sz w:val="19"/>
         </w:rPr>
-        <w:t>Analysis-locked RC or PAC:</w:t>
+        <w:t>Analysis-locked RC or Scout:</w:t>
       </w:r>
       <w:r>
         <w:rPr>
@@ -3519,7 +3580,7 @@
           <w:rFonts w:ascii="Aptos" w:hAnsi="Aptos"/>
           <w:sz w:val="19"/>
         </w:rPr>
-        <w:t>RC and PAC have automatic fault analysis enabled.</w:t>
+        <w:t>RC and Scout have automatic fault analysis enabled.</w:t>
       </w:r>
     </w:p>
     <w:p>
@@ -3532,7 +3593,7 @@
           <w:rFonts w:ascii="Aptos" w:hAnsi="Aptos"/>
           <w:sz w:val="19"/>
         </w:rPr>
-        <w:t>When an RC or PAC discovers a previously undiscovered fault during movement, it stops and preserves its remaining route.</w:t>
+        <w:t>When an RC or Scout discovers a previously undiscovered fault during movement, it stops and preserves its remaining route.</w:t>
       </w:r>
     </w:p>
     <w:p>
@@ -3571,7 +3632,7 @@
           <w:rFonts w:ascii="Aptos" w:hAnsi="Aptos"/>
           <w:sz w:val="19"/>
         </w:rPr>
-        <w:t>An RC or PAC arriving at an already discovered but unanalyzed fault also enters the one-step analysis lock.</w:t>
+        <w:t>An RC or Scout arriving at an already discovered but unanalyzed fault also enters the one-step analysis lock.</w:t>
       </w:r>
     </w:p>
     <w:p>
@@ -3715,7 +3776,7 @@
           <w:rFonts w:ascii="Aptos" w:hAnsi="Aptos"/>
           <w:sz w:val="19"/>
         </w:rPr>
-        <w:t>A Stay command is rejected when an RC or PAC is locked for automatic fault analysis.</w:t>
+        <w:t>A Stay command is rejected when an RC or Scout is locked for automatic fault analysis.</w:t>
       </w:r>
     </w:p>
     <w:p>
@@ -4467,7 +4528,7 @@
           <w:rFonts w:ascii="Aptos" w:hAnsi="Aptos"/>
           <w:sz w:val="19"/>
         </w:rPr>
-        <w:t>When an RC or PAC begins analyzing a fault, the object is locked for one complete time step.</w:t>
+        <w:t>When an RC or Scout begins analyzing a fault, the object is locked for one complete time step.</w:t>
       </w:r>
     </w:p>
     <w:p>
@@ -4677,7 +4738,7 @@
           <w:rFonts w:ascii="Aptos" w:hAnsi="Aptos"/>
           <w:sz w:val="19"/>
         </w:rPr>
-        <w:t>4. Detect automatic analysis that must begin because an RC or PAC is already at a known, unanalyzed fault.</w:t>
+        <w:t>4. Detect automatic analysis that must begin because an RC or Scout is already at a known, unanalyzed fault.</w:t>
       </w:r>
     </w:p>
     <w:p>
@@ -4690,7 +4751,7 @@
           <w:rFonts w:ascii="Aptos" w:hAnsi="Aptos"/>
           <w:sz w:val="19"/>
         </w:rPr>
-        <w:t>5. Validate and apply RC, PAC, and MPS commands.</w:t>
+        <w:t>5. Validate and apply RC, Scout, and MPS commands.</w:t>
       </w:r>
     </w:p>
     <w:p>
@@ -4865,7 +4926,7 @@
         <w:br/>
         <w:t xml:space="preserve">    "RC2": {"type": "continue"},</w:t>
         <w:br/>
-        <w:t xml:space="preserve">    "PAC1": {"type": "continue"},</w:t>
+        <w:t xml:space="preserve">    "Scout": {"type": "continue"},</w:t>
         <w:br/>
         <w:t xml:space="preserve">    "MPS1": {"type": "continue"}</w:t>
         <w:br/>
@@ -4891,7 +4952,7 @@
           <w:rFonts w:ascii="Aptos" w:hAnsi="Aptos"/>
           <w:sz w:val="19"/>
         </w:rPr>
-        <w:t>14.2 Move RC1 and PAC1</w:t>
+        <w:t>14.2 Move RC1 and Scout</w:t>
       </w:r>
     </w:p>
     <w:p>
@@ -4927,7 +4988,7 @@
         <w:br/>
         <w:t xml:space="preserve">    },</w:t>
         <w:br/>
-        <w:t xml:space="preserve">    "PAC1": {</w:t>
+        <w:t xml:space="preserve">    "Scout": {</w:t>
         <w:br/>
         <w:t xml:space="preserve">      "type": "move",</w:t>
         <w:br/>
@@ -5428,7 +5489,26 @@
     </w:p>
     <w:p>
       <w:r>
-        <w:t>For each completed time step t, the scoring contribution is sum(abs(P) * W) over all energized load-bearing Nodes. The cumulative score is the sum of these weighted contributions from T0 through the current step. Once a load has been energized at a completed time step, that load must remain energized at every later completed time step. If any previously energized load becomes de-energized, the score is reset to zero and remains permanently locked. The rule does not compare aggregate power values, so energizing a negative-P load contributes its absolute active-power magnitude and does not by itself trigger a score reset. For early completion at time step k &lt; N, the simulator projects the fully restored weighted value sum(abs(P) * W) through the remaining steps and adds it to the final score.</w:t>
+        <w:rPr>
+          <w:rFonts w:ascii="Aptos" w:hAnsi="Aptos"/>
+          <w:sz w:val="19"/>
+        </w:rPr>
+        <w:t xml:space="preserve">For early completion at time step </w:t>
+      </w:r>
+      <w:r>
+        <w:rPr>
+          <w:rFonts w:ascii="Consolas" w:hAnsi="Consolas"/>
+          <w:color w:val="1F4E79"/>
+          <w:sz w:val="17"/>
+        </w:rPr>
+        <w:t>k &lt; N</w:t>
+      </w:r>
+      <w:r>
+        <w:rPr>
+          <w:rFonts w:ascii="Aptos" w:hAnsi="Aptos"/>
+          <w:sz w:val="19"/>
+        </w:rPr>
+        <w:t>, the simulator projects the fully restored active power through the remaining steps and adds it to the final score.</w:t>
       </w:r>
     </w:p>
     <w:p>
@@ -6026,6 +6106,7 @@
     </w:p>
     <w:sectPr>
       <w:footerReference w:type="default" r:id="rId9"/>
+      <w:headerReference w:type="default" r:id="rId10"/>
       <w:pgSz w:w="12240" w:h="15840"/>
       <w:pgMar w:top="893" w:right="979" w:bottom="893" w:left="979" w:header="720" w:footer="720" w:gutter="0"/>
       <w:cols w:space="720"/>
@@ -6055,6 +6136,16 @@
     <w:fldChar w:fldCharType="end"/>
   </w:p>
 </w:ftr>
+</file>
+
+<file path=word/header1.xml><?xml version="1.0" encoding="utf-8"?>
+<w:hdr xmlns:m="http://schemas.openxmlformats.org/officeDocument/2006/math" xmlns:mc="http://schemas.openxmlformats.org/markup-compatibility/2006" xmlns:mo="http://schemas.microsoft.com/office/mac/office/2008/main" xmlns:mv="urn:schemas-microsoft-com:mac:vml" xmlns:o="urn:schemas-microsoft-com:office:office" xmlns:r="http://schemas.openxmlformats.org/officeDocument/2006/relationships" xmlns:v="urn:schemas-microsoft-com:vml" xmlns:w10="urn:schemas-microsoft-com:office:word" xmlns:w14="http://schemas.microsoft.com/office/word/2010/wordml" xmlns:w="http://schemas.openxmlformats.org/wordprocessingml/2006/main" xmlns:wne="http://schemas.microsoft.com/office/word/2006/wordml" xmlns:wp14="http://schemas.microsoft.com/office/word/2010/wordprocessingDrawing" xmlns:wp="http://schemas.openxmlformats.org/drawingml/2006/wordprocessingDrawing" xmlns:wpc="http://schemas.microsoft.com/office/word/2010/wordprocessingCanvas" xmlns:wpg="http://schemas.microsoft.com/office/word/2010/wordprocessingGroup" xmlns:wpi="http://schemas.microsoft.com/office/word/2010/wordprocessingInk" xmlns:wps="http://schemas.microsoft.com/office/word/2010/wordprocessingShape" mc:Ignorable="w14 wp14">
+  <w:p>
+    <w:pPr>
+      <w:pStyle w:val="Header"/>
+    </w:pPr>
+  </w:p>
+</w:hdr>
 </file>
 
 <file path=word/numbering.xml><?xml version="1.0" encoding="utf-8"?>

</xml_diff>